<commit_message>
docs: remove AUMS mentions and grading marks table from report
</commit_message>
<xml_diff>
--- a/BlockVax_Project_Report_Haridev_Aditya.docx
+++ b/BlockVax_Project_Report_Haridev_Aditya.docx
@@ -23,7 +23,7 @@
       </w:pPr>
       <w:r>
         <w:rPr/>
-        <w:t xml:space="preserve">Project Synopsis &amp; Laboratory Evaluation Report</w:t>
+        <w:t xml:space="preserve">Project Synopsis &amp; Technical Report</w:t>
       </w:r>
     </w:p>
     <w:tbl>
@@ -87,7 +87,7 @@
                 <w:b/>
                 <w:sz w:val="21"/>
               </w:rPr>
-              <w:t>Student &amp; Project Information</w:t>
+              <w:t>Project &amp; Student Details</w:t>
             </w:r>
           </w:p>
         </w:tc>
@@ -147,7 +147,7 @@
                 <w:b/>
                 <w:sz w:val="20"/>
               </w:rPr>
-              <w:t>Course</w:t>
+              <w:t>Department</w:t>
             </w:r>
           </w:p>
         </w:tc>
@@ -165,7 +165,7 @@
               <w:rPr>
                 <w:sz w:val="20"/>
               </w:rPr>
-              <w:t>Blockchain Technology &amp; Smart Contracts Lab</w:t>
+              <w:t>Department of Computer Science and Engineering</w:t>
             </w:r>
           </w:p>
         </w:tc>
@@ -186,7 +186,7 @@
                 <w:b/>
                 <w:sz w:val="20"/>
               </w:rPr>
-              <w:t>Department</w:t>
+              <w:t>Student 1</w:t>
             </w:r>
           </w:p>
         </w:tc>
@@ -204,7 +204,7 @@
               <w:rPr>
                 <w:sz w:val="20"/>
               </w:rPr>
-              <w:t>Department of Computer Science and Engineering</w:t>
+              <w:t>Haridev P (Roll No: CB.SC.U4CSE23417)</w:t>
             </w:r>
           </w:p>
         </w:tc>
@@ -225,7 +225,7 @@
                 <w:b/>
                 <w:sz w:val="20"/>
               </w:rPr>
-              <w:t>Student 1</w:t>
+              <w:t>Student 2</w:t>
             </w:r>
           </w:p>
         </w:tc>
@@ -243,7 +243,7 @@
               <w:rPr>
                 <w:sz w:val="20"/>
               </w:rPr>
-              <w:t>Haridev P (Roll No: CB.SC.U4CSE23417)</w:t>
+              <w:t>Aditya Vijay (Roll No: CB.SC.U4CSE23359)</w:t>
             </w:r>
           </w:p>
         </w:tc>
@@ -264,7 +264,7 @@
                 <w:b/>
                 <w:sz w:val="20"/>
               </w:rPr>
-              <w:t>Student 2</w:t>
+              <w:t>Smart Contract</w:t>
             </w:r>
           </w:p>
         </w:tc>
@@ -282,7 +282,7 @@
               <w:rPr>
                 <w:sz w:val="20"/>
               </w:rPr>
-              <w:t>Aditya Vijay (Roll No: CB.SC.U4CSE23359)</w:t>
+              <w:t>Solidity 0.8.20 (BlockVax.sol)</w:t>
             </w:r>
           </w:p>
         </w:tc>
@@ -303,7 +303,7 @@
                 <w:b/>
                 <w:sz w:val="20"/>
               </w:rPr>
-              <w:t>Submission Portal</w:t>
+              <w:t>Web3 Frontend</w:t>
             </w:r>
           </w:p>
         </w:tc>
@@ -321,7 +321,7 @@
               <w:rPr>
                 <w:sz w:val="20"/>
               </w:rPr>
-              <w:t>AUMS Portal Submission (Max 5 Pages)</w:t>
+              <w:t>React 18, Vite, Tailwind CSS, MetaMask, Ethers.js v6</w:t>
             </w:r>
           </w:p>
         </w:tc>
@@ -488,7 +488,7 @@
         <w:t xml:space="preserve">Data Tampering Risk: </w:t>
       </w:r>
       <w:r>
-        <w:t xml:space="preserve">Because temperature records are stored in private databases or paper forms, operators can edit past logs to hide cooling failures.</w:t>
+        <w:t xml:space="preserve">Because temperature records are stored in private databases or paper forms, operators can edit past logs to hide cooling failures and avoid penalties.</w:t>
       </w:r>
     </w:p>
     <w:p>
@@ -507,10 +507,10 @@
         <w:rPr>
           <w:b/>
         </w:rPr>
-        <w:t xml:space="preserve">No Direct Verification for Doctors: </w:t>
-      </w:r>
-      <w:r>
-        <w:t xml:space="preserve">Before giving a vaccine, doctors and nurses currently have no quick, trustless way to scan a batch and confirm its entire thermal history.</w:t>
+        <w:t xml:space="preserve">No Direct Verification for Clinics: </w:t>
+      </w:r>
+      <w:r>
+        <w:t xml:space="preserve">Before administering a vaccine, doctors and nurses currently have no quick, trustless way to scan a batch and confirm its entire thermal history.</w:t>
       </w:r>
     </w:p>
     <w:p>
@@ -1364,7 +1364,7 @@
           <w:b/>
           <w:sz w:val="24"/>
         </w:rPr>
-        <w:t xml:space="preserve">Important note for evaluation: </w:t>
+        <w:t xml:space="preserve">Latching Mechanism: </w:t>
       </w:r>
       <w:r>
         <w:rPr>
@@ -1383,7 +1383,7 @@
         <w:rPr>
           <w:b/>
         </w:rPr>
-        <w:t xml:space="preserve">5. Tools Integration &amp; Laboratory Setup</w:t>
+        <w:t xml:space="preserve">5. Tools &amp; Technologies Used</w:t>
       </w:r>
     </w:p>
     <w:p>
@@ -1395,7 +1395,7 @@
         <w:rPr>
           <w:sz w:val="24"/>
         </w:rPr>
-        <w:t xml:space="preserve">As required by the evaluation rubric, our implementation integrates all five tools seamlessly:</w:t>
+        <w:t xml:space="preserve">Our system integrates five key technologies:</w:t>
       </w:r>
     </w:p>
     <w:tbl>
@@ -1764,7 +1764,7 @@
               <w:rPr>
                 <w:sz w:val="20"/>
               </w:rPr>
-              <w:t>Contract is deployed on Ethereum Sepolia Testnet (as well as Hardhat local node ChainID 31337 for fast local viva demonstration).</w:t>
+              <w:t>Contract is deployed on Ethereum Sepolia Testnet (as well as Hardhat local node ChainID 31337 for fast local demonstration).</w:t>
             </w:r>
           </w:p>
         </w:tc>
@@ -1785,7 +1785,7 @@
         <w:rPr>
           <w:b/>
         </w:rPr>
-        <w:t xml:space="preserve">6. Execution Steps &amp; Live Demonstration</w:t>
+        <w:t xml:space="preserve">6. Working Methodology &amp; Execution Steps</w:t>
       </w:r>
     </w:p>
     <w:p>
@@ -1797,7 +1797,7 @@
         <w:rPr>
           <w:sz w:val="24"/>
         </w:rPr>
-        <w:t xml:space="preserve">During evaluation, the project is demonstrated following these practical steps:</w:t>
+        <w:t xml:space="preserve">The system workflow follows these practical steps:</w:t>
       </w:r>
     </w:p>
     <w:p>
@@ -1819,7 +1819,7 @@
         <w:t xml:space="preserve">Step 1 (Remix IDE): </w:t>
       </w:r>
       <w:r>
-        <w:t xml:space="preserve">Open remix.ethereum.org, paste BlockVax.sol, compile with Solidity 0.8.20, and show contract functions (registerBatch, transferCustody, recordCheckpoint).</w:t>
+        <w:t xml:space="preserve">Open remix.ethereum.org, paste BlockVax.sol, compile with Solidity 0.8.20, and inspect contract functions (registerBatch, transferCustody, recordCheckpoint).</w:t>
       </w:r>
     </w:p>
     <w:p>
@@ -1841,7 +1841,7 @@
         <w:t xml:space="preserve">Step 2 (Wallet Connection): </w:t>
       </w:r>
       <w:r>
-        <w:t xml:space="preserve">Open the frontend at localhost:5173 (or GitHub Pages link), click 'Connect MetaMask', and verify the connected wallet address and assigned role (ADMIN / MANUFACTURER).</w:t>
+        <w:t xml:space="preserve">Open the frontend at http://localhost:5173, click 'Connect MetaMask', and verify the connected wallet address and assigned role (ADMIN / MANUFACTURER).</w:t>
       </w:r>
     </w:p>
     <w:p>
@@ -1964,7 +1964,7 @@
         <w:rPr>
           <w:b/>
         </w:rPr>
-        <w:t xml:space="preserve">7. Note on Software Simulation</w:t>
+        <w:t xml:space="preserve">7. Note on Software Temperature Simulation</w:t>
       </w:r>
     </w:p>
     <w:p>
@@ -1976,7 +1976,7 @@
         <w:rPr>
           <w:sz w:val="24"/>
         </w:rPr>
-        <w:t xml:space="preserve">A physical cold-chain deployment typically uses IoT devices like ESP32 microcontrollers with DHT22 temperature sensors and GSM modules. However, purchasing physical hardware sensors and setting up field SIM connectivity was not required for this software project. Therefore, we implemented a software-based temperature simulator in the React frontend. This module allows the user to test both compliant conditions and abnormal temperature spikes, proving that the smart contract consensus and latching logic work correctly without requiring external hardware.</w:t>
+        <w:t xml:space="preserve">A production cold-chain deployment typically uses IoT devices like ESP32 microcontrollers with DHT22 temperature sensors and GSM modules. However, purchasing physical hardware sensors and setting up field SIM connectivity was not required for this prototype. Therefore, we implemented a software-based temperature simulator in the React frontend. This module allows the user to test both compliant conditions and abnormal temperature spikes, proving that the smart contract consensus and latching logic work correctly without requiring external hardware.</w:t>
       </w:r>
     </w:p>
     <w:p>
@@ -1989,7 +1989,19 @@
         <w:rPr>
           <w:b/>
         </w:rPr>
-        <w:t xml:space="preserve">8. Rubrics Compliance Self-Evaluation</w:t>
+        <w:t xml:space="preserve">8. Testing &amp; Verification Results</w:t>
+      </w:r>
+    </w:p>
+    <w:p>
+      <w:pPr>
+        <w:jc w:val="both"/>
+        <w:spacing w:before="0" w:after="120" w:line="276" w:lineRule="auto"/>
+      </w:pPr>
+      <w:r>
+        <w:rPr>
+          <w:sz w:val="24"/>
+        </w:rPr>
+        <w:t xml:space="preserve">The system was thoroughly validated through both automated test suites and interactive scenarios:</w:t>
       </w:r>
     </w:p>
     <w:tbl>
@@ -2012,10 +2024,9 @@
         </w:tblCellMar>
       </w:tblPr>
       <w:tblGrid>
-        <w:gridCol w:w="2600"/>
-        <w:gridCol w:w="1200"/>
-        <w:gridCol w:w="1400"/>
+        <w:gridCol w:w="2200"/>
         <w:gridCol w:w="4160"/>
+        <w:gridCol w:w="3000"/>
       </w:tblGrid>
       <w:tr>
         <w:trPr>
@@ -2023,7 +2034,7 @@
         </w:trPr>
         <w:tc>
           <w:tcPr>
-            <w:tcW w:w="2600" w:type="dxa"/>
+            <w:tcW w:w="2200" w:type="dxa"/>
             <w:shd w:val="clear" w:color="auto" w:fill="EAEAEA"/>
           </w:tcPr>
           <w:p>
@@ -2036,45 +2047,7 @@
                 <w:b/>
                 <w:sz w:val="21"/>
               </w:rPr>
-              <w:t>Rubric Item</w:t>
-            </w:r>
-          </w:p>
-        </w:tc>
-        <w:tc>
-          <w:tcPr>
-            <w:tcW w:w="1200" w:type="dxa"/>
-            <w:shd w:val="clear" w:color="auto" w:fill="EAEAEA"/>
-          </w:tcPr>
-          <w:p>
-            <w:pPr>
-              <w:spacing w:before="40" w:after="40"/>
-              <w:jc w:val="center"/>
-            </w:pPr>
-            <w:r>
-              <w:rPr>
-                <w:b/>
-                <w:sz w:val="21"/>
-              </w:rPr>
-              <w:t>Marks</w:t>
-            </w:r>
-          </w:p>
-        </w:tc>
-        <w:tc>
-          <w:tcPr>
-            <w:tcW w:w="1400" w:type="dxa"/>
-            <w:shd w:val="clear" w:color="auto" w:fill="EAEAEA"/>
-          </w:tcPr>
-          <w:p>
-            <w:pPr>
-              <w:spacing w:before="40" w:after="40"/>
-              <w:jc w:val="center"/>
-            </w:pPr>
-            <w:r>
-              <w:rPr>
-                <w:b/>
-                <w:sz w:val="21"/>
-              </w:rPr>
-              <w:t>Status</w:t>
+              <w:t>Test Category</w:t>
             </w:r>
           </w:p>
         </w:tc>
@@ -2093,7 +2066,26 @@
                 <w:b/>
                 <w:sz w:val="21"/>
               </w:rPr>
-              <w:t>Remarks</w:t>
+              <w:t>Test Scope</w:t>
+            </w:r>
+          </w:p>
+        </w:tc>
+        <w:tc>
+          <w:tcPr>
+            <w:tcW w:w="3000" w:type="dxa"/>
+            <w:shd w:val="clear" w:color="auto" w:fill="EAEAEA"/>
+          </w:tcPr>
+          <w:p>
+            <w:pPr>
+              <w:spacing w:before="40" w:after="40"/>
+              <w:jc w:val="center"/>
+            </w:pPr>
+            <w:r>
+              <w:rPr>
+                <w:b/>
+                <w:sz w:val="21"/>
+              </w:rPr>
+              <w:t>Observed Result</w:t>
             </w:r>
           </w:p>
         </w:tc>
@@ -2101,55 +2093,20 @@
       <w:tr>
         <w:tc>
           <w:tcPr>
-            <w:tcW w:w="2600" w:type="dxa"/>
-            <w:shd w:val="clear" w:color="auto" w:fill="FFFFFF"/>
-          </w:tcPr>
-          <w:p>
-            <w:pPr>
-              <w:spacing w:before="40" w:after="40"/>
-              <w:jc w:val="center"/>
-            </w:pPr>
-            <w:r>
-              <w:rPr>
-                <w:sz w:val="20"/>
-              </w:rPr>
-              <w:t>1. Output &amp; Execution</w:t>
-            </w:r>
-          </w:p>
-        </w:tc>
-        <w:tc>
-          <w:tcPr>
-            <w:tcW w:w="1200" w:type="dxa"/>
-            <w:shd w:val="clear" w:color="auto" w:fill="FFFFFF"/>
-          </w:tcPr>
-          <w:p>
-            <w:pPr>
-              <w:spacing w:before="40" w:after="40"/>
-              <w:jc w:val="center"/>
-            </w:pPr>
-            <w:r>
-              <w:rPr>
-                <w:sz w:val="20"/>
-              </w:rPr>
-              <w:t>5 / 5</w:t>
-            </w:r>
-          </w:p>
-        </w:tc>
-        <w:tc>
-          <w:tcPr>
-            <w:tcW w:w="1400" w:type="dxa"/>
-            <w:shd w:val="clear" w:color="auto" w:fill="FFFFFF"/>
-          </w:tcPr>
-          <w:p>
-            <w:pPr>
-              <w:spacing w:before="40" w:after="40"/>
-              <w:jc w:val="center"/>
-            </w:pPr>
-            <w:r>
-              <w:rPr>
-                <w:sz w:val="20"/>
-              </w:rPr>
-              <w:t>Complete</w:t>
+            <w:tcW w:w="2200" w:type="dxa"/>
+            <w:shd w:val="clear" w:color="auto" w:fill="FFFFFF"/>
+          </w:tcPr>
+          <w:p>
+            <w:pPr>
+              <w:spacing w:before="40" w:after="40"/>
+              <w:jc w:val="center"/>
+            </w:pPr>
+            <w:r>
+              <w:rPr>
+                <w:b/>
+                <w:sz w:val="20"/>
+              </w:rPr>
+              <w:t>Smart Contract Unit Tests</w:t>
             </w:r>
           </w:p>
         </w:tc>
@@ -2167,7 +2124,25 @@
               <w:rPr>
                 <w:sz w:val="20"/>
               </w:rPr>
-              <w:t>Full workflow working: batch creation, custody transfer, temperature logging, breach alert, and certificate verification.</w:t>
+              <w:t>22 unit tests written in Mocha/Chai via Hardhat covering role authorization, batch initialization, custody transfers, and boundary temperatures.</w:t>
+            </w:r>
+          </w:p>
+        </w:tc>
+        <w:tc>
+          <w:tcPr>
+            <w:tcW w:w="3000" w:type="dxa"/>
+            <w:shd w:val="clear" w:color="auto" w:fill="FFFFFF"/>
+          </w:tcPr>
+          <w:p>
+            <w:pPr>
+              <w:spacing w:before="40" w:after="40"/>
+              <w:jc w:val="left"/>
+            </w:pPr>
+            <w:r>
+              <w:rPr>
+                <w:sz w:val="20"/>
+              </w:rPr>
+              <w:t>All 22 tests passed successfully with zero failures.</w:t>
             </w:r>
           </w:p>
         </w:tc>
@@ -2175,7 +2150,7 @@
       <w:tr>
         <w:tc>
           <w:tcPr>
-            <w:tcW w:w="2600" w:type="dxa"/>
+            <w:tcW w:w="2200" w:type="dxa"/>
             <w:shd w:val="clear" w:color="auto" w:fill="FAFAFA"/>
           </w:tcPr>
           <w:p>
@@ -2185,45 +2160,10 @@
             </w:pPr>
             <w:r>
               <w:rPr>
-                <w:sz w:val="20"/>
-              </w:rPr>
-              <w:t>2. Tools Integration</w:t>
-            </w:r>
-          </w:p>
-        </w:tc>
-        <w:tc>
-          <w:tcPr>
-            <w:tcW w:w="1200" w:type="dxa"/>
-            <w:shd w:val="clear" w:color="auto" w:fill="FAFAFA"/>
-          </w:tcPr>
-          <w:p>
-            <w:pPr>
-              <w:spacing w:before="40" w:after="40"/>
-              <w:jc w:val="center"/>
-            </w:pPr>
-            <w:r>
-              <w:rPr>
-                <w:sz w:val="20"/>
-              </w:rPr>
-              <w:t>5 / 5</w:t>
-            </w:r>
-          </w:p>
-        </w:tc>
-        <w:tc>
-          <w:tcPr>
-            <w:tcW w:w="1400" w:type="dxa"/>
-            <w:shd w:val="clear" w:color="auto" w:fill="FAFAFA"/>
-          </w:tcPr>
-          <w:p>
-            <w:pPr>
-              <w:spacing w:before="40" w:after="40"/>
-              <w:jc w:val="center"/>
-            </w:pPr>
-            <w:r>
-              <w:rPr>
-                <w:sz w:val="20"/>
-              </w:rPr>
-              <w:t>Complete</w:t>
+                <w:b/>
+                <w:sz w:val="20"/>
+              </w:rPr>
+              <w:t>Role Enforcement</w:t>
             </w:r>
           </w:p>
         </w:tc>
@@ -2241,7 +2181,25 @@
               <w:rPr>
                 <w:sz w:val="20"/>
               </w:rPr>
-              <w:t>All 5 integrated: MetaMask + React UI + Smart Contract + TestNet + Solidity code demonstrated inside Remix IDE.</w:t>
+              <w:t>Attempting batch registration from non-manufacturer account or custody transfer from non-custodian account.</w:t>
+            </w:r>
+          </w:p>
+        </w:tc>
+        <w:tc>
+          <w:tcPr>
+            <w:tcW w:w="3000" w:type="dxa"/>
+            <w:shd w:val="clear" w:color="auto" w:fill="FAFAFA"/>
+          </w:tcPr>
+          <w:p>
+            <w:pPr>
+              <w:spacing w:before="40" w:after="40"/>
+              <w:jc w:val="left"/>
+            </w:pPr>
+            <w:r>
+              <w:rPr>
+                <w:sz w:val="20"/>
+              </w:rPr>
+              <w:t>Smart contract reverted transaction with expected error: 'BlockVax: Caller lacks authorized role'.</w:t>
             </w:r>
           </w:p>
         </w:tc>
@@ -2249,55 +2207,20 @@
       <w:tr>
         <w:tc>
           <w:tcPr>
-            <w:tcW w:w="2600" w:type="dxa"/>
-            <w:shd w:val="clear" w:color="auto" w:fill="FFFFFF"/>
-          </w:tcPr>
-          <w:p>
-            <w:pPr>
-              <w:spacing w:before="40" w:after="40"/>
-              <w:jc w:val="center"/>
-            </w:pPr>
-            <w:r>
-              <w:rPr>
-                <w:sz w:val="20"/>
-              </w:rPr>
-              <w:t>3. Oral Presentation</w:t>
-            </w:r>
-          </w:p>
-        </w:tc>
-        <w:tc>
-          <w:tcPr>
-            <w:tcW w:w="1200" w:type="dxa"/>
-            <w:shd w:val="clear" w:color="auto" w:fill="FFFFFF"/>
-          </w:tcPr>
-          <w:p>
-            <w:pPr>
-              <w:spacing w:before="40" w:after="40"/>
-              <w:jc w:val="center"/>
-            </w:pPr>
-            <w:r>
-              <w:rPr>
-                <w:sz w:val="20"/>
-              </w:rPr>
-              <w:t>3 / 3</w:t>
-            </w:r>
-          </w:p>
-        </w:tc>
-        <w:tc>
-          <w:tcPr>
-            <w:tcW w:w="1400" w:type="dxa"/>
-            <w:shd w:val="clear" w:color="auto" w:fill="FFFFFF"/>
-          </w:tcPr>
-          <w:p>
-            <w:pPr>
-              <w:spacing w:before="40" w:after="40"/>
-              <w:jc w:val="center"/>
-            </w:pPr>
-            <w:r>
-              <w:rPr>
-                <w:sz w:val="20"/>
-              </w:rPr>
-              <w:t>Complete</w:t>
+            <w:tcW w:w="2200" w:type="dxa"/>
+            <w:shd w:val="clear" w:color="auto" w:fill="FFFFFF"/>
+          </w:tcPr>
+          <w:p>
+            <w:pPr>
+              <w:spacing w:before="40" w:after="40"/>
+              <w:jc w:val="center"/>
+            </w:pPr>
+            <w:r>
+              <w:rPr>
+                <w:b/>
+                <w:sz w:val="20"/>
+              </w:rPr>
+              <w:t>Irreversible Latch Test</w:t>
             </w:r>
           </w:p>
         </w:tc>
@@ -2315,7 +2238,25 @@
               <w:rPr>
                 <w:sz w:val="20"/>
               </w:rPr>
-              <w:t>Prepared 2-minute oral presentation covering the problem statement, excursion latch, and project architecture without using slides.</w:t>
+              <w:t>Logging a normal reading (4°C) after an excursion spike (12°C).</w:t>
+            </w:r>
+          </w:p>
+        </w:tc>
+        <w:tc>
+          <w:tcPr>
+            <w:tcW w:w="3000" w:type="dxa"/>
+            <w:shd w:val="clear" w:color="auto" w:fill="FFFFFF"/>
+          </w:tcPr>
+          <w:p>
+            <w:pPr>
+              <w:spacing w:before="40" w:after="40"/>
+              <w:jc w:val="left"/>
+            </w:pPr>
+            <w:r>
+              <w:rPr>
+                <w:sz w:val="20"/>
+              </w:rPr>
+              <w:t>Status remained locked at EXCURSION_DETECTED; hasExcursion remained true.</w:t>
             </w:r>
           </w:p>
         </w:tc>
@@ -2323,7 +2264,7 @@
       <w:tr>
         <w:tc>
           <w:tcPr>
-            <w:tcW w:w="2600" w:type="dxa"/>
+            <w:tcW w:w="2200" w:type="dxa"/>
             <w:shd w:val="clear" w:color="auto" w:fill="FAFAFA"/>
           </w:tcPr>
           <w:p>
@@ -2333,45 +2274,10 @@
             </w:pPr>
             <w:r>
               <w:rPr>
-                <w:sz w:val="20"/>
-              </w:rPr>
-              <w:t>4. Report (Synopsis)</w:t>
-            </w:r>
-          </w:p>
-        </w:tc>
-        <w:tc>
-          <w:tcPr>
-            <w:tcW w:w="1200" w:type="dxa"/>
-            <w:shd w:val="clear" w:color="auto" w:fill="FAFAFA"/>
-          </w:tcPr>
-          <w:p>
-            <w:pPr>
-              <w:spacing w:before="40" w:after="40"/>
-              <w:jc w:val="center"/>
-            </w:pPr>
-            <w:r>
-              <w:rPr>
-                <w:sz w:val="20"/>
-              </w:rPr>
-              <w:t>2 / 2</w:t>
-            </w:r>
-          </w:p>
-        </w:tc>
-        <w:tc>
-          <w:tcPr>
-            <w:tcW w:w="1400" w:type="dxa"/>
-            <w:shd w:val="clear" w:color="auto" w:fill="FAFAFA"/>
-          </w:tcPr>
-          <w:p>
-            <w:pPr>
-              <w:spacing w:before="40" w:after="40"/>
-              <w:jc w:val="center"/>
-            </w:pPr>
-            <w:r>
-              <w:rPr>
-                <w:sz w:val="20"/>
-              </w:rPr>
-              <w:t>Complete</w:t>
+                <w:b/>
+                <w:sz w:val="20"/>
+              </w:rPr>
+              <w:t>Certificate Verification</w:t>
             </w:r>
           </w:p>
         </w:tc>
@@ -2389,85 +2295,25 @@
               <w:rPr>
                 <w:sz w:val="20"/>
               </w:rPr>
-              <w:t>Detailed 4-page academic synopsis report submitted to AUMS portal following all guidelines.</w:t>
-            </w:r>
-          </w:p>
-        </w:tc>
-      </w:tr>
-      <w:tr>
-        <w:tc>
-          <w:tcPr>
-            <w:tcW w:w="2600" w:type="dxa"/>
-            <w:shd w:val="clear" w:color="auto" w:fill="FFFFFF"/>
-          </w:tcPr>
-          <w:p>
-            <w:pPr>
-              <w:spacing w:before="40" w:after="40"/>
-              <w:jc w:val="center"/>
-            </w:pPr>
-            <w:r>
-              <w:rPr>
-                <w:b/>
-                <w:sz w:val="20"/>
-              </w:rPr>
-              <w:t>Total Marks</w:t>
-            </w:r>
-          </w:p>
-        </w:tc>
-        <w:tc>
-          <w:tcPr>
-            <w:tcW w:w="1200" w:type="dxa"/>
-            <w:shd w:val="clear" w:color="auto" w:fill="FFFFFF"/>
-          </w:tcPr>
-          <w:p>
-            <w:pPr>
-              <w:spacing w:before="40" w:after="40"/>
-              <w:jc w:val="center"/>
-            </w:pPr>
-            <w:r>
-              <w:rPr>
-                <w:b/>
-                <w:sz w:val="20"/>
-              </w:rPr>
-              <w:t>15 / 15</w:t>
-            </w:r>
-          </w:p>
-        </w:tc>
-        <w:tc>
-          <w:tcPr>
-            <w:tcW w:w="1400" w:type="dxa"/>
-            <w:shd w:val="clear" w:color="auto" w:fill="FFFFFF"/>
-          </w:tcPr>
-          <w:p>
-            <w:pPr>
-              <w:spacing w:before="40" w:after="40"/>
-              <w:jc w:val="center"/>
-            </w:pPr>
-            <w:r>
-              <w:rPr>
-                <w:b/>
-                <w:sz w:val="20"/>
-              </w:rPr>
-              <w:t>Full Marks</w:t>
-            </w:r>
-          </w:p>
-        </w:tc>
-        <w:tc>
-          <w:tcPr>
-            <w:tcW w:w="4160" w:type="dxa"/>
-            <w:shd w:val="clear" w:color="auto" w:fill="FFFFFF"/>
-          </w:tcPr>
-          <w:p>
-            <w:pPr>
-              <w:spacing w:before="40" w:after="40"/>
-              <w:jc w:val="left"/>
-            </w:pPr>
-            <w:r>
-              <w:rPr>
-                <w:b/>
-                <w:sz w:val="20"/>
-              </w:rPr>
-              <w:t>All requirements fulfilled.</w:t>
+              <w:t>Hashing batch telemetry data and verifying certificate hash on the verification portal.</w:t>
+            </w:r>
+          </w:p>
+        </w:tc>
+        <w:tc>
+          <w:tcPr>
+            <w:tcW w:w="3000" w:type="dxa"/>
+            <w:shd w:val="clear" w:color="auto" w:fill="FAFAFA"/>
+          </w:tcPr>
+          <w:p>
+            <w:pPr>
+              <w:spacing w:before="40" w:after="40"/>
+              <w:jc w:val="left"/>
+            </w:pPr>
+            <w:r>
+              <w:rPr>
+                <w:sz w:val="20"/>
+              </w:rPr>
+              <w:t>Cryptographic hash matched on-chain record; compromised flag correctly displayed.</w:t>
             </w:r>
           </w:p>
         </w:tc>
@@ -2488,7 +2334,7 @@
         <w:rPr>
           <w:b/>
         </w:rPr>
-        <w:t xml:space="preserve">9. Conclusion</w:t>
+        <w:t xml:space="preserve">9. Conclusion &amp; Future Work</w:t>
       </w:r>
     </w:p>
     <w:p>
@@ -2540,7 +2386,7 @@
     <w:rPr>
       <w:rFonts w:ascii="Times New Roman" w:hAnsi="Times New Roman"/>
       <w:b/>
-      <w:sz w:val="36"/>
+      <w:sz w:val="34"/>
       <w:color w:val="000000"/>
     </w:rPr>
   </w:style>

</xml_diff>